<commit_message>
Replace two-check schedule with rotating 5-slot coverage roster
Confirmed ustraveldocs.com's Terms of Service prohibit automated
bots/scripts checking slot availability, so instead of 24/7 automation
the team covers 5 check windows/day (9:30, 11:30, 1:30, 3:30, 5:30) on a
rotating roster across all 8 agents — closes the "nobody's watching"
gap without violating the portal's ToS or risking a client's booked
appointment getting access-limited.

Co-Authored-By: Claude Sonnet 5 <noreply@anthropic.com>
Claude-Session: https://claude.ai/code/session_01DiEcNy7XAwqHLRjhRBareN
</commit_message>
<xml_diff>
--- a/docs/SOP_Visa_Appointment_Slot_Monitoring.docx
+++ b/docs/SOP_Visa_Appointment_Slot_Monitoring.docx
@@ -96,19 +96,19 @@
           <w:sz w:val="24"/>
           <w:szCs w:val="24"/>
         </w:rPr>
-        <w:t xml:space="preserve">2. Daily Manual Check Windows</w:t>
-      </w:r>
-    </w:p>
-    <w:p>
-      <w:pPr>
-        <w:spacing w:after="100"/>
-      </w:pPr>
-      <w:r>
-        <w:rPr>
-          <w:sz w:val="20"/>
-          <w:szCs w:val="20"/>
-        </w:rPr>
-        <w:t xml:space="preserve">Appointment slots most often open after cancellations or batch releases. Rather than automating access to the portal, we check it consistently, by hand, at fixed times — this is the manual-monitoring habit that gets most of the benefit of automation with none of the compliance risk.</w:t>
+        <w:t xml:space="preserve">2. Coverage Roster — Not a Bot</w:t>
+      </w:r>
+    </w:p>
+    <w:p>
+      <w:pPr>
+        <w:spacing w:after="100"/>
+      </w:pPr>
+      <w:r>
+        <w:rPr>
+          <w:sz w:val="20"/>
+          <w:szCs w:val="20"/>
+        </w:rPr>
+        <w:t xml:space="preserve">ustraveldocs.com's Terms of Service explicitly prohibit bots, crawlers, and scripts checking slot availability — accounts that trip this get access-limited, which can delay or lose an already-booked client appointment. So coverage comes from people, spread across the day, instead of one script running 24/7.</w:t>
       </w:r>
     </w:p>
     <w:p>
@@ -125,7 +125,7 @@
           <w:sz w:val="20"/>
           <w:szCs w:val="20"/>
         </w:rPr>
-        <w:t xml:space="preserve">9:00 AM — first check of the day, before client calls start.</w:t>
+        <w:t xml:space="preserve">Five check windows daily, roughly every 2 hours: 9:30 AM, 11:30 AM, 1:30 PM, 3:30 PM, 5:30 PM.</w:t>
       </w:r>
     </w:p>
     <w:p>
@@ -142,19 +142,36 @@
           <w:sz w:val="20"/>
           <w:szCs w:val="20"/>
         </w:rPr>
-        <w:t xml:space="preserve">3:00 PM — second check, after the typical early-afternoon release window.</w:t>
-      </w:r>
-    </w:p>
-    <w:p>
-      <w:pPr>
-        <w:spacing w:after="100"/>
-      </w:pPr>
-      <w:r>
-        <w:rPr>
-          <w:sz w:val="20"/>
-          <w:szCs w:val="20"/>
-        </w:rPr>
-        <w:t xml:space="preserve">Team Lead assigns the day's checker on the morning huddle. Log every check — including “no slots” — in the Slot Watch Log (see Section 3).</w:t>
+        <w:t xml:space="preserve">Each slot is assigned to a different agent on a rotating basis — see the Coverage Roster tab in the Slot Watch Log workbook. No one covers the same slot two days running.</w:t>
+      </w:r>
+    </w:p>
+    <w:p>
+      <w:pPr>
+        <w:pStyle w:val="ListParagraph"/>
+        <w:numPr>
+          <w:ilvl w:val="0"/>
+          <w:numId w:val="2"/>
+        </w:numPr>
+        <w:spacing w:after="60"/>
+      </w:pPr>
+      <w:r>
+        <w:rPr>
+          <w:sz w:val="20"/>
+          <w:szCs w:val="20"/>
+        </w:rPr>
+        <w:t xml:space="preserve">Sunday: office closed, no checks scheduled.</w:t>
+      </w:r>
+    </w:p>
+    <w:p>
+      <w:pPr>
+        <w:spacing w:after="100"/>
+      </w:pPr>
+      <w:r>
+        <w:rPr>
+          <w:sz w:val="20"/>
+          <w:szCs w:val="20"/>
+        </w:rPr>
+        <w:t xml:space="preserve">Swap names in the roster (blue cells) for leave or sick days — just keep every slot covered. Whoever is on shift logs the result immediately — including “no slots” — in the Slot Watch Log (see Section 3).</w:t>
       </w:r>
     </w:p>
     <w:p>
@@ -182,7 +199,7 @@
           <w:sz w:val="20"/>
           <w:szCs w:val="20"/>
         </w:rPr>
-        <w:t xml:space="preserve">Every check, whatever the result, gets one row in the Slot Watch Log spreadsheet (Date, Time, Checked By, Consulate, Visa Category, Earliest Date Seen, Notes). After 2–3 weeks this reveals real drop patterns — which weekday, which time — far more reliably than guessing, and lets us tighten the check windows in Section 2 over time.</w:t>
+        <w:t xml:space="preserve">Every check, whatever the result, gets one row in the Slot Watch Log spreadsheet (Date, Time, Checked By, Consulate, Visa Category, Earliest Date Seen, Notes). After 2–3 weeks this reveals real drop patterns — which weekday, which time — far more reliably than guessing, and lets us tighten the check windows and roster in Section 2 over time.</w:t>
       </w:r>
     </w:p>
     <w:p>

</xml_diff>